<commit_message>
SonarQube with Jenkins Pipeline
</commit_message>
<xml_diff>
--- a/Session-25/Sonarcube & jenkins on wsl.docx
+++ b/Session-25/Sonarcube & jenkins on wsl.docx
@@ -12,30 +12,8 @@
         <w:rPr>
           <w:lang w:val="en-US"/>
         </w:rPr>
-        <w:t xml:space="preserve">Step :1 Install </w:t>
-      </w:r>
-      <w:proofErr w:type="spellStart"/>
-      <w:r>
-        <w:rPr>
-          <w:lang w:val="en-US"/>
-        </w:rPr>
-        <w:t>SonarQube</w:t>
-      </w:r>
-      <w:proofErr w:type="spellEnd"/>
-      <w:r>
-        <w:rPr>
-          <w:lang w:val="en-US"/>
-        </w:rPr>
-        <w:t xml:space="preserve"> Server on </w:t>
-      </w:r>
-      <w:proofErr w:type="spellStart"/>
-      <w:r>
-        <w:rPr>
-          <w:lang w:val="en-US"/>
-        </w:rPr>
-        <w:t>WSl</w:t>
-      </w:r>
-      <w:proofErr w:type="spellEnd"/>
+        <w:t>Step :1 Install SonarQube Server on WSl</w:t>
+      </w:r>
     </w:p>
     <w:p>
       <w:pPr>
@@ -70,30 +48,8 @@
         <w:rPr>
           <w:lang w:val="en-US"/>
         </w:rPr>
-        <w:t xml:space="preserve">Must have </w:t>
-      </w:r>
-      <w:proofErr w:type="spellStart"/>
-      <w:r>
-        <w:rPr>
-          <w:lang w:val="en-US"/>
-        </w:rPr>
-        <w:t>JDk</w:t>
-      </w:r>
-      <w:proofErr w:type="spellEnd"/>
-      <w:r>
-        <w:rPr>
-          <w:lang w:val="en-US"/>
-        </w:rPr>
-        <w:t xml:space="preserve"> 17 and above in </w:t>
-      </w:r>
-      <w:proofErr w:type="spellStart"/>
-      <w:r>
-        <w:rPr>
-          <w:lang w:val="en-US"/>
-        </w:rPr>
-        <w:t>wsl</w:t>
-      </w:r>
-      <w:proofErr w:type="spellEnd"/>
+        <w:t>Must have JDk 17 and above in wsl</w:t>
+      </w:r>
     </w:p>
     <w:p>
       <w:pPr>
@@ -106,19 +62,11 @@
           <w:lang w:val="en-US"/>
         </w:rPr>
       </w:pPr>
-      <w:proofErr w:type="spellStart"/>
-      <w:r>
-        <w:rPr>
-          <w:lang w:val="en-US"/>
-        </w:rPr>
-        <w:t>sudo</w:t>
-      </w:r>
-      <w:proofErr w:type="spellEnd"/>
-      <w:r>
-        <w:rPr>
-          <w:lang w:val="en-US"/>
-        </w:rPr>
-        <w:t xml:space="preserve"> apt update</w:t>
+      <w:r>
+        <w:rPr>
+          <w:lang w:val="en-US"/>
+        </w:rPr>
+        <w:t>sudo apt update</w:t>
       </w:r>
     </w:p>
     <w:p>
@@ -132,19 +80,11 @@
           <w:lang w:val="en-US"/>
         </w:rPr>
       </w:pPr>
-      <w:proofErr w:type="spellStart"/>
-      <w:r>
-        <w:rPr>
-          <w:lang w:val="en-US"/>
-        </w:rPr>
-        <w:t>sudo</w:t>
-      </w:r>
-      <w:proofErr w:type="spellEnd"/>
-      <w:r>
-        <w:rPr>
-          <w:lang w:val="en-US"/>
-        </w:rPr>
-        <w:t xml:space="preserve"> apt install openjdk-17-y</w:t>
+      <w:r>
+        <w:rPr>
+          <w:lang w:val="en-US"/>
+        </w:rPr>
+        <w:t>sudo apt install openjdk-17-y</w:t>
       </w:r>
     </w:p>
     <w:p>
@@ -244,47 +184,11 @@
           <w:lang w:val="en-US"/>
         </w:rPr>
       </w:pPr>
-      <w:proofErr w:type="spellStart"/>
-      <w:r>
-        <w:rPr>
-          <w:lang w:val="en-US"/>
-        </w:rPr>
-        <w:t>sudo</w:t>
-      </w:r>
-      <w:proofErr w:type="spellEnd"/>
-      <w:r>
-        <w:rPr>
-          <w:lang w:val="en-US"/>
-        </w:rPr>
-        <w:t xml:space="preserve"> apt install </w:t>
-      </w:r>
-      <w:proofErr w:type="spellStart"/>
-      <w:r>
-        <w:rPr>
-          <w:lang w:val="en-US"/>
-        </w:rPr>
-        <w:t>postgresql</w:t>
-      </w:r>
-      <w:proofErr w:type="spellEnd"/>
-      <w:r>
-        <w:rPr>
-          <w:lang w:val="en-US"/>
-        </w:rPr>
-        <w:t xml:space="preserve"> </w:t>
-      </w:r>
-      <w:proofErr w:type="spellStart"/>
-      <w:r>
-        <w:rPr>
-          <w:lang w:val="en-US"/>
-        </w:rPr>
-        <w:t>postgresql-contrib</w:t>
-      </w:r>
-      <w:proofErr w:type="spellEnd"/>
-      <w:r>
-        <w:rPr>
-          <w:lang w:val="en-US"/>
-        </w:rPr>
-        <w:t xml:space="preserve"> –y</w:t>
+      <w:r>
+        <w:rPr>
+          <w:lang w:val="en-US"/>
+        </w:rPr>
+        <w:t>sudo apt install postgresql postgresql-contrib –y</w:t>
       </w:r>
     </w:p>
     <w:p>
@@ -298,21 +202,7 @@
         <w:rPr>
           <w:lang w:val="en-US"/>
         </w:rPr>
-        <w:t xml:space="preserve">Now Create </w:t>
-      </w:r>
-      <w:proofErr w:type="spellStart"/>
-      <w:r>
-        <w:rPr>
-          <w:lang w:val="en-US"/>
-        </w:rPr>
-        <w:t>SonarQube</w:t>
-      </w:r>
-      <w:proofErr w:type="spellEnd"/>
-      <w:r>
-        <w:rPr>
-          <w:lang w:val="en-US"/>
-        </w:rPr>
-        <w:t xml:space="preserve"> DB and User:</w:t>
+        <w:t>Now Create SonarQube DB and User:</w:t>
       </w:r>
     </w:p>
     <w:p>
@@ -326,42 +216,12 @@
           <w:lang w:val="en-US"/>
         </w:rPr>
       </w:pPr>
-      <w:proofErr w:type="spellStart"/>
-      <w:r>
-        <w:rPr>
-          <w:lang w:val="en-US"/>
-        </w:rPr>
-        <w:t>sudo</w:t>
-      </w:r>
-      <w:proofErr w:type="spellEnd"/>
-      <w:r>
-        <w:rPr>
-          <w:lang w:val="en-US"/>
-        </w:rPr>
-        <w:t xml:space="preserve"> –u </w:t>
-      </w:r>
-      <w:proofErr w:type="spellStart"/>
-      <w:r>
-        <w:rPr>
-          <w:lang w:val="en-US"/>
-        </w:rPr>
-        <w:t>postgres</w:t>
-      </w:r>
-      <w:proofErr w:type="spellEnd"/>
-      <w:r>
-        <w:rPr>
-          <w:lang w:val="en-US"/>
-        </w:rPr>
-        <w:t xml:space="preserve"> </w:t>
-      </w:r>
-      <w:proofErr w:type="spellStart"/>
-      <w:r>
-        <w:rPr>
-          <w:lang w:val="en-US"/>
-        </w:rPr>
-        <w:t>psql</w:t>
-      </w:r>
-      <w:proofErr w:type="spellEnd"/>
+      <w:r>
+        <w:rPr>
+          <w:lang w:val="en-US"/>
+        </w:rPr>
+        <w:t>sudo –u postgres psql</w:t>
+      </w:r>
     </w:p>
     <w:p>
       <w:pPr>
@@ -396,21 +256,7 @@
         <w:rPr>
           <w:lang w:val="en-US"/>
         </w:rPr>
-        <w:t xml:space="preserve">CREATE DATABASE </w:t>
-      </w:r>
-      <w:proofErr w:type="spellStart"/>
-      <w:r>
-        <w:rPr>
-          <w:lang w:val="en-US"/>
-        </w:rPr>
-        <w:t>sonarqube</w:t>
-      </w:r>
-      <w:proofErr w:type="spellEnd"/>
-      <w:r>
-        <w:rPr>
-          <w:lang w:val="en-US"/>
-        </w:rPr>
-        <w:t xml:space="preserve"> OWNER sonar;</w:t>
+        <w:t>CREATE DATABASE sonarqube OWNER sonar;</w:t>
       </w:r>
     </w:p>
     <w:p>
@@ -558,21 +404,7 @@
         <w:rPr>
           <w:lang w:val="en-US"/>
         </w:rPr>
-        <w:t>Step:</w:t>
-      </w:r>
-      <w:proofErr w:type="gramStart"/>
-      <w:r>
-        <w:rPr>
-          <w:lang w:val="en-US"/>
-        </w:rPr>
-        <w:t>3  Install</w:t>
-      </w:r>
-      <w:proofErr w:type="gramEnd"/>
-      <w:r>
-        <w:rPr>
-          <w:lang w:val="en-US"/>
-        </w:rPr>
-        <w:t xml:space="preserve"> required Dependencies</w:t>
+        <w:t>Step:3  Install required Dependencies</w:t>
       </w:r>
     </w:p>
     <w:p>
@@ -586,33 +418,11 @@
           <w:lang w:val="en-US"/>
         </w:rPr>
       </w:pPr>
-      <w:proofErr w:type="spellStart"/>
-      <w:r>
-        <w:rPr>
-          <w:lang w:val="en-US"/>
-        </w:rPr>
-        <w:t>sudo</w:t>
-      </w:r>
-      <w:proofErr w:type="spellEnd"/>
-      <w:r>
-        <w:rPr>
-          <w:lang w:val="en-US"/>
-        </w:rPr>
-        <w:t xml:space="preserve"> apt install unzip </w:t>
-      </w:r>
-      <w:proofErr w:type="spellStart"/>
-      <w:r>
-        <w:rPr>
-          <w:lang w:val="en-US"/>
-        </w:rPr>
-        <w:t>wget</w:t>
-      </w:r>
-      <w:proofErr w:type="spellEnd"/>
-      <w:r>
-        <w:rPr>
-          <w:lang w:val="en-US"/>
-        </w:rPr>
-        <w:t xml:space="preserve"> gnupg2 –y</w:t>
+      <w:r>
+        <w:rPr>
+          <w:lang w:val="en-US"/>
+        </w:rPr>
+        <w:t>sudo apt install unzip wget gnupg2 –y</w:t>
       </w:r>
     </w:p>
     <w:p>
@@ -681,33 +491,11 @@
           <w:lang w:val="en-US"/>
         </w:rPr>
       </w:pPr>
-      <w:proofErr w:type="spellStart"/>
-      <w:r>
-        <w:rPr>
-          <w:lang w:val="en-US"/>
-        </w:rPr>
-        <w:t>sudo</w:t>
-      </w:r>
-      <w:proofErr w:type="spellEnd"/>
-      <w:r>
-        <w:rPr>
-          <w:lang w:val="en-US"/>
-        </w:rPr>
-        <w:t xml:space="preserve"> </w:t>
-      </w:r>
-      <w:proofErr w:type="spellStart"/>
-      <w:r>
-        <w:rPr>
-          <w:lang w:val="en-US"/>
-        </w:rPr>
-        <w:t>wget</w:t>
-      </w:r>
-      <w:proofErr w:type="spellEnd"/>
-      <w:r>
-        <w:rPr>
-          <w:lang w:val="en-US"/>
-        </w:rPr>
-        <w:t xml:space="preserve"> </w:t>
+      <w:r>
+        <w:rPr>
+          <w:lang w:val="en-US"/>
+        </w:rPr>
+        <w:t xml:space="preserve">sudo wget </w:t>
       </w:r>
       <w:hyperlink r:id="rId9" w:history="1">
         <w:r>
@@ -730,19 +518,11 @@
           <w:lang w:val="en-US"/>
         </w:rPr>
       </w:pPr>
-      <w:proofErr w:type="spellStart"/>
-      <w:r>
-        <w:rPr>
-          <w:lang w:val="en-US"/>
-        </w:rPr>
-        <w:t>sudo</w:t>
-      </w:r>
-      <w:proofErr w:type="spellEnd"/>
-      <w:r>
-        <w:rPr>
-          <w:lang w:val="en-US"/>
-        </w:rPr>
-        <w:t xml:space="preserve"> </w:t>
+      <w:r>
+        <w:rPr>
+          <w:lang w:val="en-US"/>
+        </w:rPr>
+        <w:t xml:space="preserve">sudo </w:t>
       </w:r>
       <w:r>
         <w:rPr>
@@ -768,19 +548,11 @@
           <w:lang w:val="en-US"/>
         </w:rPr>
       </w:pPr>
-      <w:proofErr w:type="spellStart"/>
-      <w:r>
-        <w:rPr>
-          <w:lang w:val="en-US"/>
-        </w:rPr>
-        <w:t>sudo</w:t>
-      </w:r>
-      <w:proofErr w:type="spellEnd"/>
-      <w:r>
-        <w:rPr>
-          <w:lang w:val="en-US"/>
-        </w:rPr>
-        <w:t xml:space="preserve"> mv </w:t>
+      <w:r>
+        <w:rPr>
+          <w:lang w:val="en-US"/>
+        </w:rPr>
+        <w:t xml:space="preserve">sudo mv </w:t>
       </w:r>
       <w:r>
         <w:rPr>
@@ -792,16 +564,8 @@
         <w:rPr>
           <w:lang w:val="en-US"/>
         </w:rPr>
-        <w:t xml:space="preserve"> </w:t>
-      </w:r>
-      <w:proofErr w:type="spellStart"/>
-      <w:r>
-        <w:rPr>
-          <w:lang w:val="en-US"/>
-        </w:rPr>
-        <w:t>sonarqube</w:t>
-      </w:r>
-      <w:proofErr w:type="spellEnd"/>
+        <w:t xml:space="preserve"> sonarqube</w:t>
+      </w:r>
     </w:p>
     <w:p>
       <w:pPr>
@@ -814,57 +578,13 @@
           <w:lang w:val="en-US"/>
         </w:rPr>
       </w:pPr>
-      <w:proofErr w:type="spellStart"/>
       <w:r>
         <w:rPr>
           <w:lang w:val="en-US"/>
         </w:rPr>
         <w:lastRenderedPageBreak/>
-        <w:t>sudo</w:t>
-      </w:r>
-      <w:proofErr w:type="spellEnd"/>
-      <w:r>
-        <w:rPr>
-          <w:lang w:val="en-US"/>
-        </w:rPr>
-        <w:t xml:space="preserve"> </w:t>
-      </w:r>
-      <w:proofErr w:type="spellStart"/>
-      <w:r>
-        <w:rPr>
-          <w:lang w:val="en-US"/>
-        </w:rPr>
-        <w:t>chown</w:t>
-      </w:r>
-      <w:proofErr w:type="spellEnd"/>
-      <w:r>
-        <w:rPr>
-          <w:lang w:val="en-US"/>
-        </w:rPr>
-        <w:t xml:space="preserve"> –R $</w:t>
-      </w:r>
-      <w:proofErr w:type="gramStart"/>
-      <w:r>
-        <w:rPr>
-          <w:lang w:val="en-US"/>
-        </w:rPr>
-        <w:t>USER:$</w:t>
-      </w:r>
-      <w:proofErr w:type="gramEnd"/>
-      <w:r>
-        <w:rPr>
-          <w:lang w:val="en-US"/>
-        </w:rPr>
-        <w:t xml:space="preserve">USER </w:t>
-      </w:r>
-      <w:proofErr w:type="spellStart"/>
-      <w:r>
-        <w:rPr>
-          <w:lang w:val="en-US"/>
-        </w:rPr>
-        <w:t>sonarqube</w:t>
-      </w:r>
-      <w:proofErr w:type="spellEnd"/>
+        <w:t>sudo chown –R $USER:$USER sonarqube</w:t>
+      </w:r>
     </w:p>
     <w:p>
       <w:pPr>
@@ -877,56 +597,12 @@
           <w:lang w:val="en-US"/>
         </w:rPr>
       </w:pPr>
-      <w:proofErr w:type="spellStart"/>
-      <w:r>
-        <w:rPr>
-          <w:lang w:val="en-US"/>
-        </w:rPr>
-        <w:t>nano</w:t>
-      </w:r>
-      <w:proofErr w:type="spellEnd"/>
-      <w:r>
-        <w:rPr>
-          <w:lang w:val="en-US"/>
-        </w:rPr>
-        <w:t xml:space="preserve"> /opt/</w:t>
-      </w:r>
-      <w:proofErr w:type="spellStart"/>
-      <w:r>
-        <w:rPr>
-          <w:lang w:val="en-US"/>
-        </w:rPr>
-        <w:t>sonarcube</w:t>
-      </w:r>
-      <w:proofErr w:type="spellEnd"/>
-      <w:r>
-        <w:rPr>
-          <w:lang w:val="en-US"/>
-        </w:rPr>
-        <w:t>/</w:t>
-      </w:r>
-      <w:proofErr w:type="spellStart"/>
-      <w:r>
-        <w:rPr>
-          <w:lang w:val="en-US"/>
-        </w:rPr>
-        <w:t>conf</w:t>
-      </w:r>
-      <w:proofErr w:type="spellEnd"/>
-      <w:r>
-        <w:rPr>
-          <w:lang w:val="en-US"/>
-        </w:rPr>
-        <w:t>/</w:t>
-      </w:r>
-      <w:proofErr w:type="spellStart"/>
-      <w:r>
-        <w:rPr>
-          <w:lang w:val="en-US"/>
-        </w:rPr>
-        <w:t>sonar.properties</w:t>
-      </w:r>
-      <w:proofErr w:type="spellEnd"/>
+      <w:r>
+        <w:rPr>
+          <w:lang w:val="en-US"/>
+        </w:rPr>
+        <w:t>nano /opt/sonarcube/conf/sonar.properties</w:t>
+      </w:r>
     </w:p>
     <w:p>
       <w:pPr>
@@ -939,35 +615,13 @@
         <w:rPr>
           <w:lang w:val="en-US"/>
         </w:rPr>
-        <w:t xml:space="preserve">(if opt folder is not available create </w:t>
-      </w:r>
-      <w:proofErr w:type="gramStart"/>
-      <w:r>
-        <w:rPr>
-          <w:lang w:val="en-US"/>
-        </w:rPr>
-        <w:t>using  command</w:t>
-      </w:r>
-      <w:proofErr w:type="gramEnd"/>
-      <w:r>
-        <w:rPr>
-          <w:lang w:val="en-US"/>
-        </w:rPr>
-        <w:t xml:space="preserve"> “</w:t>
-      </w:r>
-      <w:proofErr w:type="spellStart"/>
-      <w:r>
-        <w:rPr>
-          <w:lang w:val="en-US"/>
-        </w:rPr>
-        <w:t>mkdir</w:t>
-      </w:r>
-      <w:proofErr w:type="spellEnd"/>
-      <w:r>
-        <w:rPr>
-          <w:lang w:val="en-US"/>
-        </w:rPr>
-        <w:t xml:space="preserve"> opt</w:t>
+        <w:t>(if opt folder is not available create using  command “</w:t>
+      </w:r>
+      <w:r>
+        <w:rPr>
+          <w:lang w:val="en-US"/>
+        </w:rPr>
+        <w:t>mkdir opt</w:t>
       </w:r>
       <w:r>
         <w:rPr>
@@ -1050,94 +704,38 @@
           <w:lang w:val="en-US"/>
         </w:rPr>
       </w:pPr>
-      <w:proofErr w:type="spellStart"/>
-      <w:proofErr w:type="gramStart"/>
-      <w:r>
-        <w:rPr>
-          <w:lang w:val="en-US"/>
-        </w:rPr>
-        <w:t>sonar.jdbc</w:t>
-      </w:r>
-      <w:proofErr w:type="gramEnd"/>
-      <w:r>
-        <w:rPr>
-          <w:lang w:val="en-US"/>
-        </w:rPr>
-        <w:t>.username</w:t>
-      </w:r>
-      <w:proofErr w:type="spellEnd"/>
-      <w:r>
-        <w:rPr>
-          <w:lang w:val="en-US"/>
-        </w:rPr>
-        <w:t>=sonar</w:t>
-      </w:r>
-    </w:p>
-    <w:p>
-      <w:pPr>
-        <w:rPr>
-          <w:lang w:val="en-US"/>
-        </w:rPr>
-      </w:pPr>
-      <w:proofErr w:type="spellStart"/>
-      <w:proofErr w:type="gramStart"/>
-      <w:r>
-        <w:rPr>
-          <w:lang w:val="en-US"/>
-        </w:rPr>
-        <w:t>sonar.jdbc</w:t>
-      </w:r>
-      <w:proofErr w:type="gramEnd"/>
-      <w:r>
-        <w:rPr>
-          <w:lang w:val="en-US"/>
-        </w:rPr>
-        <w:t>.password</w:t>
-      </w:r>
-      <w:proofErr w:type="spellEnd"/>
-      <w:r>
-        <w:rPr>
-          <w:lang w:val="en-US"/>
-        </w:rPr>
-        <w:t>=sonar</w:t>
-      </w:r>
-    </w:p>
-    <w:p>
-      <w:pPr>
-        <w:rPr>
-          <w:lang w:val="en-US"/>
-        </w:rPr>
-      </w:pPr>
-      <w:r>
-        <w:rPr>
-          <w:lang w:val="en-US"/>
-        </w:rPr>
-        <w:t>sonar.jdbc.url=</w:t>
-      </w:r>
-      <w:proofErr w:type="spellStart"/>
-      <w:proofErr w:type="gramStart"/>
-      <w:r>
-        <w:rPr>
-          <w:lang w:val="en-US"/>
-        </w:rPr>
-        <w:t>jdbc:postgresql</w:t>
-      </w:r>
-      <w:proofErr w:type="spellEnd"/>
-      <w:r>
-        <w:rPr>
-          <w:lang w:val="en-US"/>
-        </w:rPr>
-        <w:t>://localhost/</w:t>
-      </w:r>
-      <w:proofErr w:type="spellStart"/>
-      <w:r>
-        <w:rPr>
-          <w:lang w:val="en-US"/>
-        </w:rPr>
-        <w:t>sonarqube</w:t>
-      </w:r>
-      <w:proofErr w:type="spellEnd"/>
-      <w:proofErr w:type="gramEnd"/>
+      <w:r>
+        <w:rPr>
+          <w:lang w:val="en-US"/>
+        </w:rPr>
+        <w:t>sonar.jdbc.username=sonar</w:t>
+      </w:r>
+    </w:p>
+    <w:p>
+      <w:pPr>
+        <w:rPr>
+          <w:lang w:val="en-US"/>
+        </w:rPr>
+      </w:pPr>
+      <w:r>
+        <w:rPr>
+          <w:lang w:val="en-US"/>
+        </w:rPr>
+        <w:t>sonar.jdbc.password=sonar</w:t>
+      </w:r>
+    </w:p>
+    <w:p>
+      <w:pPr>
+        <w:rPr>
+          <w:lang w:val="en-US"/>
+        </w:rPr>
+      </w:pPr>
+      <w:r>
+        <w:rPr>
+          <w:lang w:val="en-US"/>
+        </w:rPr>
+        <w:t>sonar.jdbc.url=jdbc:postgresql://localhost/sonarqube</w:t>
+      </w:r>
     </w:p>
     <w:p>
       <w:pPr>
@@ -1158,110 +756,58 @@
           <w:lang w:val="en-US"/>
         </w:rPr>
       </w:pPr>
-      <w:proofErr w:type="spellStart"/>
-      <w:proofErr w:type="gramStart"/>
-      <w:r>
-        <w:rPr>
-          <w:lang w:val="en-US"/>
-        </w:rPr>
-        <w:t>sonar.projectKey</w:t>
-      </w:r>
-      <w:proofErr w:type="spellEnd"/>
-      <w:proofErr w:type="gramEnd"/>
-      <w:r>
-        <w:rPr>
-          <w:lang w:val="en-US"/>
-        </w:rPr>
-        <w:t>=</w:t>
-      </w:r>
-      <w:proofErr w:type="spellStart"/>
-      <w:r>
-        <w:rPr>
-          <w:lang w:val="en-US"/>
-        </w:rPr>
-        <w:t>Sonar_Python</w:t>
-      </w:r>
-      <w:proofErr w:type="spellEnd"/>
-    </w:p>
-    <w:p>
-      <w:pPr>
-        <w:rPr>
-          <w:lang w:val="en-US"/>
-        </w:rPr>
-      </w:pPr>
-      <w:proofErr w:type="spellStart"/>
-      <w:proofErr w:type="gramStart"/>
-      <w:r>
-        <w:rPr>
-          <w:lang w:val="en-US"/>
-        </w:rPr>
-        <w:t>sonar.sources</w:t>
-      </w:r>
-      <w:proofErr w:type="spellEnd"/>
-      <w:proofErr w:type="gramEnd"/>
-      <w:r>
-        <w:rPr>
-          <w:lang w:val="en-US"/>
-        </w:rPr>
-        <w:t>=.</w:t>
-      </w:r>
-    </w:p>
-    <w:p>
-      <w:pPr>
-        <w:rPr>
-          <w:lang w:val="en-US"/>
-        </w:rPr>
-      </w:pPr>
-      <w:proofErr w:type="spellStart"/>
-      <w:proofErr w:type="gramStart"/>
-      <w:r>
-        <w:rPr>
-          <w:lang w:val="en-US"/>
-        </w:rPr>
-        <w:t>sonar.python</w:t>
-      </w:r>
-      <w:proofErr w:type="gramEnd"/>
-      <w:r>
-        <w:rPr>
-          <w:lang w:val="en-US"/>
-        </w:rPr>
-        <w:t>.version</w:t>
-      </w:r>
-      <w:proofErr w:type="spellEnd"/>
-      <w:r>
-        <w:rPr>
-          <w:lang w:val="en-US"/>
-        </w:rPr>
-        <w:t>=3.10</w:t>
-      </w:r>
-    </w:p>
-    <w:p>
-      <w:pPr>
-        <w:rPr>
-          <w:lang w:val="en-US"/>
-        </w:rPr>
-      </w:pPr>
-    </w:p>
-    <w:p>
-      <w:pPr>
-        <w:rPr>
-          <w:lang w:val="en-US"/>
-        </w:rPr>
-      </w:pPr>
-      <w:r>
-        <w:rPr>
-          <w:lang w:val="en-US"/>
-        </w:rPr>
-        <w:t xml:space="preserve">Step: 5 Run the </w:t>
-      </w:r>
-      <w:proofErr w:type="spellStart"/>
-      <w:r>
-        <w:rPr>
-          <w:lang w:val="en-US"/>
-        </w:rPr>
-        <w:t>sonarqube</w:t>
-      </w:r>
-      <w:proofErr w:type="spellEnd"/>
+      <w:r>
+        <w:rPr>
+          <w:lang w:val="en-US"/>
+        </w:rPr>
+        <w:t>sonar.projectKey=Sonar_Python</w:t>
+      </w:r>
+    </w:p>
+    <w:p>
+      <w:pPr>
+        <w:rPr>
+          <w:lang w:val="en-US"/>
+        </w:rPr>
+      </w:pPr>
+      <w:r>
+        <w:rPr>
+          <w:lang w:val="en-US"/>
+        </w:rPr>
+        <w:t>sonar.sources=.</w:t>
+      </w:r>
+    </w:p>
+    <w:p>
+      <w:pPr>
+        <w:rPr>
+          <w:lang w:val="en-US"/>
+        </w:rPr>
+      </w:pPr>
+      <w:r>
+        <w:rPr>
+          <w:lang w:val="en-US"/>
+        </w:rPr>
+        <w:t>sonar.python.version=3.10</w:t>
+      </w:r>
+    </w:p>
+    <w:p>
+      <w:pPr>
+        <w:rPr>
+          <w:lang w:val="en-US"/>
+        </w:rPr>
+      </w:pPr>
+    </w:p>
+    <w:p>
+      <w:pPr>
+        <w:rPr>
+          <w:lang w:val="en-US"/>
+        </w:rPr>
+      </w:pPr>
+      <w:r>
+        <w:rPr>
+          <w:lang w:val="en-US"/>
+        </w:rPr>
+        <w:t>Step: 5 Run the sonarqube</w:t>
+      </w:r>
     </w:p>
     <w:p>
       <w:pPr>
@@ -1278,21 +824,7 @@
         <w:rPr>
           <w:lang w:val="en-US"/>
         </w:rPr>
-        <w:t>cd /opt/</w:t>
-      </w:r>
-      <w:proofErr w:type="spellStart"/>
-      <w:r>
-        <w:rPr>
-          <w:lang w:val="en-US"/>
-        </w:rPr>
-        <w:t>sonarqube</w:t>
-      </w:r>
-      <w:proofErr w:type="spellEnd"/>
-      <w:r>
-        <w:rPr>
-          <w:lang w:val="en-US"/>
-        </w:rPr>
-        <w:t>/bin/linux-x86-64</w:t>
+        <w:t>cd /opt/sonarqube/bin/linux-x86-64</w:t>
       </w:r>
     </w:p>
     <w:p>
@@ -1341,63 +873,33 @@
         <w:rPr>
           <w:lang w:val="en-US"/>
         </w:rPr>
-        <w:t xml:space="preserve">Step:6 Log in to </w:t>
-      </w:r>
-      <w:proofErr w:type="spellStart"/>
-      <w:r>
-        <w:rPr>
-          <w:lang w:val="en-US"/>
-        </w:rPr>
-        <w:t>sonarqube</w:t>
-      </w:r>
-      <w:proofErr w:type="spellEnd"/>
-    </w:p>
-    <w:p>
-      <w:pPr>
-        <w:rPr>
-          <w:lang w:val="en-US"/>
-        </w:rPr>
-      </w:pPr>
-      <w:proofErr w:type="spellStart"/>
-      <w:r>
-        <w:rPr>
-          <w:lang w:val="en-US"/>
-        </w:rPr>
-        <w:t>Goto</w:t>
-      </w:r>
-      <w:proofErr w:type="spellEnd"/>
-      <w:r>
-        <w:rPr>
-          <w:lang w:val="en-US"/>
-        </w:rPr>
-        <w:t>&gt; browser&gt; localhost:9000</w:t>
-      </w:r>
-    </w:p>
-    <w:p>
-      <w:pPr>
-        <w:rPr>
-          <w:lang w:val="en-US"/>
-        </w:rPr>
-      </w:pPr>
-      <w:r>
-        <w:rPr>
-          <w:lang w:val="en-US"/>
-        </w:rPr>
-        <w:t xml:space="preserve">(wait for </w:t>
-      </w:r>
-      <w:proofErr w:type="spellStart"/>
-      <w:r>
-        <w:rPr>
-          <w:lang w:val="en-US"/>
-        </w:rPr>
-        <w:t>atleast</w:t>
-      </w:r>
-      <w:proofErr w:type="spellEnd"/>
-      <w:r>
-        <w:rPr>
-          <w:lang w:val="en-US"/>
-        </w:rPr>
-        <w:t xml:space="preserve"> 5-10 min, as it will take a time to start)</w:t>
+        <w:t>Step:6 Log in to sonarqube</w:t>
+      </w:r>
+    </w:p>
+    <w:p>
+      <w:pPr>
+        <w:rPr>
+          <w:lang w:val="en-US"/>
+        </w:rPr>
+      </w:pPr>
+      <w:r>
+        <w:rPr>
+          <w:lang w:val="en-US"/>
+        </w:rPr>
+        <w:t>Goto&gt; browser&gt; localhost:9000</w:t>
+      </w:r>
+    </w:p>
+    <w:p>
+      <w:pPr>
+        <w:rPr>
+          <w:lang w:val="en-US"/>
+        </w:rPr>
+      </w:pPr>
+      <w:r>
+        <w:rPr>
+          <w:lang w:val="en-US"/>
+        </w:rPr>
+        <w:t>(wait for atleast 5-10 min, as it will take a time to start)</w:t>
       </w:r>
     </w:p>
     <w:p>
@@ -1411,21 +913,11 @@
           <w:lang w:val="en-US"/>
         </w:rPr>
       </w:pPr>
-      <w:proofErr w:type="spellStart"/>
-      <w:proofErr w:type="gramStart"/>
-      <w:r>
-        <w:rPr>
-          <w:lang w:val="en-US"/>
-        </w:rPr>
-        <w:t>Default;t</w:t>
-      </w:r>
-      <w:proofErr w:type="spellEnd"/>
-      <w:proofErr w:type="gramEnd"/>
-      <w:r>
-        <w:rPr>
-          <w:lang w:val="en-US"/>
-        </w:rPr>
-        <w:t xml:space="preserve"> username and password are</w:t>
+      <w:r>
+        <w:rPr>
+          <w:lang w:val="en-US"/>
+        </w:rPr>
+        <w:t>Default;t username and password are</w:t>
       </w:r>
     </w:p>
     <w:p>
@@ -1494,16 +986,8 @@
         <w:rPr>
           <w:lang w:val="en-US"/>
         </w:rPr>
-        <w:t xml:space="preserve">Now click on </w:t>
-      </w:r>
-      <w:proofErr w:type="spellStart"/>
-      <w:r>
-        <w:rPr>
-          <w:lang w:val="en-US"/>
-        </w:rPr>
-        <w:t>MyAccount</w:t>
-      </w:r>
-      <w:proofErr w:type="spellEnd"/>
+        <w:t>Now click on MyAccount</w:t>
+      </w:r>
     </w:p>
     <w:p>
       <w:pPr>
@@ -1818,21 +1302,7 @@
         <w:rPr>
           <w:lang w:val="en-US"/>
         </w:rPr>
-        <w:t xml:space="preserve">Step: 8 Open Jenkins and add </w:t>
-      </w:r>
-      <w:proofErr w:type="spellStart"/>
-      <w:r>
-        <w:rPr>
-          <w:lang w:val="en-US"/>
-        </w:rPr>
-        <w:t>sonarqube</w:t>
-      </w:r>
-      <w:proofErr w:type="spellEnd"/>
-      <w:r>
-        <w:rPr>
-          <w:lang w:val="en-US"/>
-        </w:rPr>
-        <w:t xml:space="preserve"> to it</w:t>
+        <w:t>Step: 8 Open Jenkins and add sonarqube to it</w:t>
       </w:r>
     </w:p>
     <w:p>
@@ -1896,42 +1366,12 @@
           <w:lang w:val="en-US"/>
         </w:rPr>
       </w:pPr>
-      <w:proofErr w:type="spellStart"/>
-      <w:r>
-        <w:rPr>
-          <w:lang w:val="en-US"/>
-        </w:rPr>
-        <w:t>Goto</w:t>
-      </w:r>
-      <w:proofErr w:type="spellEnd"/>
-      <w:r>
-        <w:rPr>
-          <w:lang w:val="en-US"/>
-        </w:rPr>
-        <w:t xml:space="preserve">&gt; manage Jenkins&gt; add </w:t>
-      </w:r>
-      <w:proofErr w:type="spellStart"/>
-      <w:r>
-        <w:rPr>
-          <w:lang w:val="en-US"/>
-        </w:rPr>
-        <w:t>sonarqube</w:t>
-      </w:r>
-      <w:proofErr w:type="spellEnd"/>
-      <w:r>
-        <w:rPr>
-          <w:lang w:val="en-US"/>
-        </w:rPr>
-        <w:t xml:space="preserve"> server for </w:t>
-      </w:r>
-      <w:proofErr w:type="spellStart"/>
-      <w:r>
-        <w:rPr>
-          <w:lang w:val="en-US"/>
-        </w:rPr>
-        <w:t>jenkins</w:t>
-      </w:r>
-      <w:proofErr w:type="spellEnd"/>
+      <w:r>
+        <w:rPr>
+          <w:lang w:val="en-US"/>
+        </w:rPr>
+        <w:t>Goto&gt; manage Jenkins&gt; add sonarqube server for jenkins</w:t>
+      </w:r>
     </w:p>
     <w:p>
       <w:pPr>
@@ -1998,21 +1438,7 @@
         <w:rPr>
           <w:lang w:val="en-US"/>
         </w:rPr>
-        <w:t xml:space="preserve">Step:9 </w:t>
-      </w:r>
-      <w:proofErr w:type="spellStart"/>
-      <w:r>
-        <w:rPr>
-          <w:lang w:val="en-US"/>
-        </w:rPr>
-        <w:t>goto</w:t>
-      </w:r>
-      <w:proofErr w:type="spellEnd"/>
-      <w:r>
-        <w:rPr>
-          <w:lang w:val="en-US"/>
-        </w:rPr>
-        <w:t xml:space="preserve">&gt; manage Jenkins&gt; tools(system)&gt; </w:t>
+        <w:t xml:space="preserve">Step:9 goto&gt; manage Jenkins&gt; tools(system)&gt; </w:t>
       </w:r>
     </w:p>
     <w:p>
@@ -2289,48 +1715,20 @@
         <w:rPr>
           <w:lang w:val="en-US"/>
         </w:rPr>
-        <w:t xml:space="preserve">        SONARQUBE_ENV = '</w:t>
-      </w:r>
-      <w:proofErr w:type="spellStart"/>
-      <w:r>
-        <w:rPr>
-          <w:lang w:val="en-US"/>
-        </w:rPr>
-        <w:t>MySonar</w:t>
-      </w:r>
-      <w:proofErr w:type="spellEnd"/>
-      <w:r>
-        <w:rPr>
-          <w:lang w:val="en-US"/>
-        </w:rPr>
-        <w:t>'                  // Jenkins → Manage Jenkins → Configure System</w:t>
-      </w:r>
-    </w:p>
-    <w:p>
-      <w:pPr>
-        <w:rPr>
-          <w:lang w:val="en-US"/>
-        </w:rPr>
-      </w:pPr>
-      <w:r>
-        <w:rPr>
-          <w:lang w:val="en-US"/>
-        </w:rPr>
-        <w:t xml:space="preserve">        SONAR_TOKEN = credentials('MY_SONAR_TOKEN</w:t>
-      </w:r>
-      <w:proofErr w:type="gramStart"/>
-      <w:r>
-        <w:rPr>
-          <w:lang w:val="en-US"/>
-        </w:rPr>
-        <w:t xml:space="preserve">')   </w:t>
-      </w:r>
-      <w:proofErr w:type="gramEnd"/>
-      <w:r>
-        <w:rPr>
-          <w:lang w:val="en-US"/>
-        </w:rPr>
-        <w:t>// From Jenkins Credentials store</w:t>
+        <w:t xml:space="preserve">        SONARQUBE_ENV = 'MySonar'                  // Jenkins → Manage Jenkins → Configure System</w:t>
+      </w:r>
+    </w:p>
+    <w:p>
+      <w:pPr>
+        <w:rPr>
+          <w:lang w:val="en-US"/>
+        </w:rPr>
+      </w:pPr>
+      <w:r>
+        <w:rPr>
+          <w:lang w:val="en-US"/>
+        </w:rPr>
+        <w:t xml:space="preserve">        SONAR_TOKEN = credentials('MY_SONAR_TOKEN')   // From Jenkins Credentials store</w:t>
       </w:r>
     </w:p>
     <w:p>
@@ -2416,49 +1814,7 @@
         <w:rPr>
           <w:lang w:val="en-US"/>
         </w:rPr>
-        <w:t xml:space="preserve">                </w:t>
-      </w:r>
-      <w:proofErr w:type="spellStart"/>
-      <w:r>
-        <w:rPr>
-          <w:lang w:val="en-US"/>
-        </w:rPr>
-        <w:t>git</w:t>
-      </w:r>
-      <w:proofErr w:type="spellEnd"/>
-      <w:r>
-        <w:rPr>
-          <w:lang w:val="en-US"/>
-        </w:rPr>
-        <w:t xml:space="preserve"> url: 'https://github.com/</w:t>
-      </w:r>
-      <w:proofErr w:type="spellStart"/>
-      <w:r>
-        <w:rPr>
-          <w:lang w:val="en-US"/>
-        </w:rPr>
-        <w:t>Nikunj</w:t>
-      </w:r>
-      <w:proofErr w:type="spellEnd"/>
-      <w:r>
-        <w:rPr>
-          <w:lang w:val="en-US"/>
-        </w:rPr>
-        <w:t>-Java/</w:t>
-      </w:r>
-      <w:proofErr w:type="spellStart"/>
-      <w:r>
-        <w:rPr>
-          <w:lang w:val="en-US"/>
-        </w:rPr>
-        <w:t>Sonar_Python.git</w:t>
-      </w:r>
-      <w:proofErr w:type="spellEnd"/>
-      <w:r>
-        <w:rPr>
-          <w:lang w:val="en-US"/>
-        </w:rPr>
-        <w:t>', branch: 'main'</w:t>
+        <w:t xml:space="preserve">                git url: 'https://github.com/Nikunj-Java/Sonar_Python.git', branch: 'main'</w:t>
       </w:r>
     </w:p>
     <w:p>
@@ -2504,35 +1860,7 @@
         <w:rPr>
           <w:lang w:val="en-US"/>
         </w:rPr>
-        <w:t xml:space="preserve">        </w:t>
-      </w:r>
-      <w:proofErr w:type="gramStart"/>
-      <w:r>
-        <w:rPr>
-          <w:lang w:val="en-US"/>
-        </w:rPr>
-        <w:t>stage(</w:t>
-      </w:r>
-      <w:proofErr w:type="gramEnd"/>
-      <w:r>
-        <w:rPr>
-          <w:lang w:val="en-US"/>
-        </w:rPr>
-        <w:t>'</w:t>
-      </w:r>
-      <w:proofErr w:type="spellStart"/>
-      <w:r>
-        <w:rPr>
-          <w:lang w:val="en-US"/>
-        </w:rPr>
-        <w:t>SonarQube</w:t>
-      </w:r>
-      <w:proofErr w:type="spellEnd"/>
-      <w:r>
-        <w:rPr>
-          <w:lang w:val="en-US"/>
-        </w:rPr>
-        <w:t xml:space="preserve"> Analysis') {</w:t>
+        <w:t xml:space="preserve">        stage('SonarQube Analysis') {</w:t>
       </w:r>
     </w:p>
     <w:p>
@@ -2558,48 +1886,20 @@
         <w:rPr>
           <w:lang w:val="en-US"/>
         </w:rPr>
-        <w:t xml:space="preserve">                </w:t>
-      </w:r>
-      <w:proofErr w:type="spellStart"/>
-      <w:r>
-        <w:rPr>
-          <w:lang w:val="en-US"/>
-        </w:rPr>
-        <w:t>withSonarQubeEnv</w:t>
-      </w:r>
-      <w:proofErr w:type="spellEnd"/>
-      <w:r>
-        <w:rPr>
-          <w:lang w:val="en-US"/>
-        </w:rPr>
-        <w:t>("${SONARQUBE_ENV}") {</w:t>
-      </w:r>
-    </w:p>
-    <w:p>
-      <w:pPr>
-        <w:rPr>
-          <w:lang w:val="en-US"/>
-        </w:rPr>
-      </w:pPr>
-      <w:r>
-        <w:rPr>
-          <w:lang w:val="en-US"/>
-        </w:rPr>
-        <w:t xml:space="preserve">                    </w:t>
-      </w:r>
-      <w:proofErr w:type="spellStart"/>
-      <w:r>
-        <w:rPr>
-          <w:lang w:val="en-US"/>
-        </w:rPr>
-        <w:t>sh</w:t>
-      </w:r>
-      <w:proofErr w:type="spellEnd"/>
-      <w:r>
-        <w:rPr>
-          <w:lang w:val="en-US"/>
-        </w:rPr>
-        <w:t xml:space="preserve"> '''</w:t>
+        <w:t xml:space="preserve">                withSonarQubeEnv("${SONARQUBE_ENV}") {</w:t>
+      </w:r>
+    </w:p>
+    <w:p>
+      <w:pPr>
+        <w:rPr>
+          <w:lang w:val="en-US"/>
+        </w:rPr>
+      </w:pPr>
+      <w:r>
+        <w:rPr>
+          <w:lang w:val="en-US"/>
+        </w:rPr>
+        <w:t xml:space="preserve">                    sh '''</w:t>
       </w:r>
     </w:p>
     <w:p>
@@ -2625,145 +1925,59 @@
         <w:rPr>
           <w:lang w:val="en-US"/>
         </w:rPr>
-        <w:t xml:space="preserve">                        -</w:t>
-      </w:r>
-      <w:proofErr w:type="spellStart"/>
-      <w:r>
-        <w:rPr>
-          <w:lang w:val="en-US"/>
-        </w:rPr>
-        <w:t>Dsonar.projectKey</w:t>
-      </w:r>
-      <w:proofErr w:type="spellEnd"/>
-      <w:r>
-        <w:rPr>
-          <w:lang w:val="en-US"/>
-        </w:rPr>
-        <w:t>=</w:t>
-      </w:r>
-      <w:proofErr w:type="spellStart"/>
-      <w:r>
-        <w:rPr>
-          <w:lang w:val="en-US"/>
-        </w:rPr>
-        <w:t>Sonar_Python</w:t>
-      </w:r>
-      <w:proofErr w:type="spellEnd"/>
-      <w:r>
-        <w:rPr>
-          <w:lang w:val="en-US"/>
-        </w:rPr>
-        <w:t xml:space="preserve"> \</w:t>
-      </w:r>
-    </w:p>
-    <w:p>
-      <w:pPr>
-        <w:rPr>
-          <w:lang w:val="en-US"/>
-        </w:rPr>
-      </w:pPr>
-      <w:r>
-        <w:rPr>
-          <w:lang w:val="en-US"/>
-        </w:rPr>
-        <w:t xml:space="preserve">                        -</w:t>
-      </w:r>
-      <w:proofErr w:type="spellStart"/>
-      <w:r>
-        <w:rPr>
-          <w:lang w:val="en-US"/>
-        </w:rPr>
-        <w:t>Dsonar.sources</w:t>
-      </w:r>
-      <w:proofErr w:type="spellEnd"/>
-      <w:r>
-        <w:rPr>
-          <w:lang w:val="en-US"/>
-        </w:rPr>
-        <w:t>=app \</w:t>
-      </w:r>
-    </w:p>
-    <w:p>
-      <w:pPr>
-        <w:rPr>
-          <w:lang w:val="en-US"/>
-        </w:rPr>
-      </w:pPr>
-      <w:r>
-        <w:rPr>
-          <w:lang w:val="en-US"/>
-        </w:rPr>
-        <w:t xml:space="preserve">                        -</w:t>
-      </w:r>
-      <w:proofErr w:type="spellStart"/>
-      <w:r>
-        <w:rPr>
-          <w:lang w:val="en-US"/>
-        </w:rPr>
-        <w:t>Dsonat.tests</w:t>
-      </w:r>
-      <w:proofErr w:type="spellEnd"/>
-      <w:r>
-        <w:rPr>
-          <w:lang w:val="en-US"/>
-        </w:rPr>
-        <w:t>=tests \</w:t>
-      </w:r>
-    </w:p>
-    <w:p>
-      <w:pPr>
-        <w:rPr>
-          <w:lang w:val="en-US"/>
-        </w:rPr>
-      </w:pPr>
-      <w:r>
-        <w:rPr>
-          <w:lang w:val="en-US"/>
-        </w:rPr>
-        <w:t xml:space="preserve">                        -</w:t>
-      </w:r>
-      <w:proofErr w:type="spellStart"/>
-      <w:proofErr w:type="gramStart"/>
-      <w:r>
-        <w:rPr>
-          <w:lang w:val="en-US"/>
-        </w:rPr>
-        <w:t>Dsonar.python.version</w:t>
-      </w:r>
-      <w:proofErr w:type="spellEnd"/>
-      <w:proofErr w:type="gramEnd"/>
-      <w:r>
-        <w:rPr>
-          <w:lang w:val="en-US"/>
-        </w:rPr>
-        <w:t>=3.10 \</w:t>
-      </w:r>
-    </w:p>
-    <w:p>
-      <w:pPr>
-        <w:rPr>
-          <w:lang w:val="en-US"/>
-        </w:rPr>
-      </w:pPr>
-      <w:r>
-        <w:rPr>
-          <w:lang w:val="en-US"/>
-        </w:rPr>
-        <w:t xml:space="preserve">                        -</w:t>
-      </w:r>
-      <w:proofErr w:type="spellStart"/>
-      <w:r>
-        <w:rPr>
-          <w:lang w:val="en-US"/>
-        </w:rPr>
-        <w:t>Dsonar.login</w:t>
-      </w:r>
-      <w:proofErr w:type="spellEnd"/>
-      <w:r>
-        <w:rPr>
-          <w:lang w:val="en-US"/>
-        </w:rPr>
-        <w:t>=${MY_SONAR_TOKEN}</w:t>
+        <w:t xml:space="preserve">                        -Dsonar.projectKey=Sonar_Python \</w:t>
+      </w:r>
+    </w:p>
+    <w:p>
+      <w:pPr>
+        <w:rPr>
+          <w:lang w:val="en-US"/>
+        </w:rPr>
+      </w:pPr>
+      <w:r>
+        <w:rPr>
+          <w:lang w:val="en-US"/>
+        </w:rPr>
+        <w:t xml:space="preserve">                        -Dsonar.sources=app \</w:t>
+      </w:r>
+    </w:p>
+    <w:p>
+      <w:pPr>
+        <w:rPr>
+          <w:lang w:val="en-US"/>
+        </w:rPr>
+      </w:pPr>
+      <w:r>
+        <w:rPr>
+          <w:lang w:val="en-US"/>
+        </w:rPr>
+        <w:t xml:space="preserve">                        -Dsonat.tests=tests \</w:t>
+      </w:r>
+    </w:p>
+    <w:p>
+      <w:pPr>
+        <w:rPr>
+          <w:lang w:val="en-US"/>
+        </w:rPr>
+      </w:pPr>
+      <w:r>
+        <w:rPr>
+          <w:lang w:val="en-US"/>
+        </w:rPr>
+        <w:t xml:space="preserve">                        -Dsonar.python.version=3.10 \</w:t>
+      </w:r>
+    </w:p>
+    <w:p>
+      <w:pPr>
+        <w:rPr>
+          <w:lang w:val="en-US"/>
+        </w:rPr>
+      </w:pPr>
+      <w:r>
+        <w:rPr>
+          <w:lang w:val="en-US"/>
+        </w:rPr>
+        <w:t xml:space="preserve">                        -Dsonar.login=${MY_SONAR_TOKEN}</w:t>
       </w:r>
     </w:p>
     <w:p>
@@ -2835,21 +2049,7 @@
         <w:rPr>
           <w:lang w:val="en-US"/>
         </w:rPr>
-        <w:t xml:space="preserve">        </w:t>
-      </w:r>
-      <w:proofErr w:type="gramStart"/>
-      <w:r>
-        <w:rPr>
-          <w:lang w:val="en-US"/>
-        </w:rPr>
-        <w:t>stage(</w:t>
-      </w:r>
-      <w:proofErr w:type="gramEnd"/>
-      <w:r>
-        <w:rPr>
-          <w:lang w:val="en-US"/>
-        </w:rPr>
-        <w:t>'Quality Gate') {</w:t>
+        <w:t xml:space="preserve">        stage('Quality Gate') {</w:t>
       </w:r>
     </w:p>
     <w:p>
@@ -2875,62 +2075,20 @@
         <w:rPr>
           <w:lang w:val="en-US"/>
         </w:rPr>
-        <w:t xml:space="preserve">                </w:t>
-      </w:r>
-      <w:proofErr w:type="gramStart"/>
-      <w:r>
-        <w:rPr>
-          <w:lang w:val="en-US"/>
-        </w:rPr>
-        <w:t>timeout(</w:t>
-      </w:r>
-      <w:proofErr w:type="gramEnd"/>
-      <w:r>
-        <w:rPr>
-          <w:lang w:val="en-US"/>
-        </w:rPr>
-        <w:t>time: 2, unit: 'MINUTES') {</w:t>
-      </w:r>
-    </w:p>
-    <w:p>
-      <w:pPr>
-        <w:rPr>
-          <w:lang w:val="en-US"/>
-        </w:rPr>
-      </w:pPr>
-      <w:r>
-        <w:rPr>
-          <w:lang w:val="en-US"/>
-        </w:rPr>
-        <w:t xml:space="preserve">                    </w:t>
-      </w:r>
-      <w:proofErr w:type="spellStart"/>
-      <w:r>
-        <w:rPr>
-          <w:lang w:val="en-US"/>
-        </w:rPr>
-        <w:t>waitForQualityGate</w:t>
-      </w:r>
-      <w:proofErr w:type="spellEnd"/>
-      <w:r>
-        <w:rPr>
-          <w:lang w:val="en-US"/>
-        </w:rPr>
-        <w:t xml:space="preserve"> </w:t>
-      </w:r>
-      <w:proofErr w:type="spellStart"/>
-      <w:r>
-        <w:rPr>
-          <w:lang w:val="en-US"/>
-        </w:rPr>
-        <w:t>abortPipeline</w:t>
-      </w:r>
-      <w:proofErr w:type="spellEnd"/>
-      <w:r>
-        <w:rPr>
-          <w:lang w:val="en-US"/>
-        </w:rPr>
-        <w:t>: true</w:t>
+        <w:t xml:space="preserve">                timeout(time: 2, unit: 'MINUTES') {</w:t>
+      </w:r>
+    </w:p>
+    <w:p>
+      <w:pPr>
+        <w:rPr>
+          <w:lang w:val="en-US"/>
+        </w:rPr>
+      </w:pPr>
+      <w:r>
+        <w:rPr>
+          <w:lang w:val="en-US"/>
+        </w:rPr>
+        <w:t xml:space="preserve">                    waitForQualityGate abortPipeline: true</w:t>
       </w:r>
     </w:p>
     <w:p>
@@ -3049,7 +2207,6 @@
           <w:lang w:val="en-US"/>
         </w:rPr>
       </w:pPr>
-      <w:bookmarkStart w:id="0" w:name="_GoBack"/>
       <w:r>
         <w:rPr>
           <w:noProof/>
@@ -3098,7 +2255,6 @@
           </wp:inline>
         </w:drawing>
       </w:r>
-      <w:bookmarkEnd w:id="0"/>
     </w:p>
     <w:p>
       <w:pPr>
@@ -3133,21 +2289,7 @@
         <w:rPr>
           <w:lang w:val="en-US"/>
         </w:rPr>
-        <w:t xml:space="preserve">check the </w:t>
-      </w:r>
-      <w:proofErr w:type="spellStart"/>
-      <w:r>
-        <w:rPr>
-          <w:lang w:val="en-US"/>
-        </w:rPr>
-        <w:t>sonarqube</w:t>
-      </w:r>
-      <w:proofErr w:type="spellEnd"/>
-      <w:r>
-        <w:rPr>
-          <w:lang w:val="en-US"/>
-        </w:rPr>
-        <w:t xml:space="preserve"> projects</w:t>
+        <w:t>check the sonarqube projects</w:t>
       </w:r>
     </w:p>
     <w:p>
@@ -3212,6 +2354,22 @@
           <w:lang w:val="en-US"/>
         </w:rPr>
       </w:pPr>
+    </w:p>
+    <w:p>
+      <w:pPr>
+        <w:rPr>
+          <w:lang w:val="en-US"/>
+        </w:rPr>
+      </w:pPr>
+    </w:p>
+    <w:p>
+      <w:pPr>
+        <w:rPr>
+          <w:lang w:val="en-US"/>
+        </w:rPr>
+      </w:pPr>
+      <w:bookmarkStart w:id="0" w:name="_GoBack"/>
+      <w:bookmarkEnd w:id="0"/>
     </w:p>
     <w:sectPr>
       <w:pgSz w:w="11906" w:h="16838"/>

</xml_diff>